<commit_message>
Agrega link del repositorio al informe
</commit_message>
<xml_diff>
--- a/docs/informe_baes_pluxee.docx
+++ b/docs/informe_baes_pluxee.docx
@@ -20,39 +20,94 @@
     </w:p>
     <w:p>
       <w:pPr>
-        <w:spacing w:after="200"/>
         <w:jc w:val="center"/>
-      </w:pPr>
-      <w:r>
-        <w:rPr>
-          <w:rFonts w:ascii="Calibri" w:eastAsia="Calibri" w:hAnsi="Calibri" w:cs="Calibri"/>
-          <w:color w:val="555555"/>
-        </w:rPr>
-        <w:t xml:space="preserve">Ingeniería de Soluciones con IA (ISY0101) — Agente informativo BAES para </w:t>
-      </w:r>
-      <w:proofErr w:type="spellStart"/>
-      <w:r>
-        <w:rPr>
-          <w:rFonts w:ascii="Calibri" w:eastAsia="Calibri" w:hAnsi="Calibri" w:cs="Calibri"/>
-          <w:color w:val="555555"/>
-        </w:rPr>
-        <w:t>Pluxee</w:t>
-      </w:r>
-      <w:proofErr w:type="spellEnd"/>
-      <w:r>
-        <w:rPr>
-          <w:rFonts w:ascii="Calibri" w:eastAsia="Calibri" w:hAnsi="Calibri" w:cs="Calibri"/>
-          <w:color w:val="555555"/>
-        </w:rPr>
-        <w:t xml:space="preserve"> </w:t>
-      </w:r>
-      <w:r>
         <w:rPr>
           <w:rFonts w:ascii="Calibri" w:eastAsia="Calibri" w:hAnsi="Calibri" w:cs="Calibri"/>
           <w:color w:val="555555"/>
           <w:u w:val="single"/>
         </w:rPr>
+      </w:pPr>
+      <w:r>
+        <w:rPr>
+          <w:rFonts w:ascii="Calibri" w:eastAsia="Calibri" w:hAnsi="Calibri" w:cs="Calibri"/>
+          <w:color w:val="555555"/>
+        </w:rPr>
+        <w:t xml:space="preserve">Ingeniería de Soluciones con IA (ISY0101) — Agente informativo BAES para </w:t>
+      </w:r>
+      <w:proofErr w:type="spellStart"/>
+      <w:r>
+        <w:rPr>
+          <w:rFonts w:ascii="Calibri" w:eastAsia="Calibri" w:hAnsi="Calibri" w:cs="Calibri"/>
+          <w:color w:val="555555"/>
+        </w:rPr>
+        <w:t>Pluxee</w:t>
+      </w:r>
+      <w:proofErr w:type="spellEnd"/>
+      <w:r>
+        <w:rPr>
+          <w:rFonts w:ascii="Calibri" w:eastAsia="Calibri" w:hAnsi="Calibri" w:cs="Calibri"/>
+          <w:color w:val="555555"/>
+        </w:rPr>
+        <w:t xml:space="preserve"> </w:t>
+      </w:r>
+      <w:r>
+        <w:rPr>
+          <w:rFonts w:ascii="Calibri" w:eastAsia="Calibri" w:hAnsi="Calibri" w:cs="Calibri"/>
+          <w:color w:val="555555"/>
+          <w:u w:val="single"/>
+        </w:rPr>
         <w:t>Chile</w:t>
+      </w:r>
+    </w:p>
+    <w:p>
+      <w:pPr>
+        <w:jc w:val="center"/>
+        <w:rPr>
+          <w:rFonts w:ascii="Calibri" w:eastAsia="Calibri" w:hAnsi="Calibri" w:cs="Calibri"/>
+          <w:color w:val="555555"/>
+        </w:rPr>
+      </w:pPr>
+      <w:r>
+        <w:rPr>
+          <w:rFonts w:ascii="Calibri" w:eastAsia="Calibri" w:hAnsi="Calibri" w:cs="Calibri"/>
+          <w:color w:val="555555"/>
+        </w:rPr>
+        <w:t>Integrante: Ignacio Gomez</w:t>
+      </w:r>
+    </w:p>
+    <w:p>
+      <w:pPr>
+        <w:jc w:val="center"/>
+        <w:rPr>
+          <w:rFonts w:ascii="Calibri" w:eastAsia="Calibri" w:hAnsi="Calibri" w:cs="Calibri"/>
+          <w:color w:val="555555"/>
+        </w:rPr>
+      </w:pPr>
+      <w:r>
+        <w:rPr>
+          <w:rFonts w:ascii="Calibri" w:eastAsia="Calibri" w:hAnsi="Calibri" w:cs="Calibri"/>
+          <w:color w:val="555555"/>
+        </w:rPr>
+        <w:t>Profesor: Francisco Macaya</w:t>
+      </w:r>
+    </w:p>
+    <w:p>
+      <w:pPr>
+        <w:jc w:val="center"/>
+      </w:pPr>
+      <w:r>
+        <w:rPr>
+          <w:rFonts w:ascii="Calibri" w:eastAsia="Calibri" w:hAnsi="Calibri" w:cs="Calibri"/>
+          <w:color w:val="555555"/>
+        </w:rPr>
+        <w:t xml:space="preserve">Repositorio: </w:t>
+      </w:r>
+      <w:r>
+        <w:rPr>
+          <w:rFonts w:ascii="Calibri" w:eastAsia="Calibri" w:hAnsi="Calibri" w:cs="Calibri"/>
+          <w:color w:val="555555"/>
+        </w:rPr>
+        <w:t>https://github.com/Lucem-nacho/pluxee-baes-agent.git</w:t>
       </w:r>
     </w:p>
     <w:p>
@@ -434,12 +489,6 @@
         <w:gridCol w:w="2015"/>
       </w:tblGrid>
       <w:tr>
-        <w:tblPrEx>
-          <w:tblCellMar>
-            <w:top w:w="0" w:type="dxa"/>
-            <w:bottom w:w="0" w:type="dxa"/>
-          </w:tblCellMar>
-        </w:tblPrEx>
         <w:tc>
           <w:tcPr>
             <w:tcW w:w="2200" w:type="dxa"/>
@@ -514,12 +563,6 @@
         </w:tc>
       </w:tr>
       <w:tr>
-        <w:tblPrEx>
-          <w:tblCellMar>
-            <w:top w:w="0" w:type="dxa"/>
-            <w:bottom w:w="0" w:type="dxa"/>
-          </w:tblCellMar>
-        </w:tblPrEx>
         <w:tc>
           <w:tcPr>
             <w:tcW w:w="2200" w:type="dxa"/>
@@ -592,12 +635,6 @@
         </w:tc>
       </w:tr>
       <w:tr>
-        <w:tblPrEx>
-          <w:tblCellMar>
-            <w:top w:w="0" w:type="dxa"/>
-            <w:bottom w:w="0" w:type="dxa"/>
-          </w:tblCellMar>
-        </w:tblPrEx>
         <w:tc>
           <w:tcPr>
             <w:tcW w:w="2200" w:type="dxa"/>
@@ -670,12 +707,6 @@
         </w:tc>
       </w:tr>
       <w:tr>
-        <w:tblPrEx>
-          <w:tblCellMar>
-            <w:top w:w="0" w:type="dxa"/>
-            <w:bottom w:w="0" w:type="dxa"/>
-          </w:tblCellMar>
-        </w:tblPrEx>
         <w:tc>
           <w:tcPr>
             <w:tcW w:w="2200" w:type="dxa"/>
@@ -738,12 +769,6 @@
         </w:tc>
       </w:tr>
       <w:tr>
-        <w:tblPrEx>
-          <w:tblCellMar>
-            <w:top w:w="0" w:type="dxa"/>
-            <w:bottom w:w="0" w:type="dxa"/>
-          </w:tblCellMar>
-        </w:tblPrEx>
         <w:tc>
           <w:tcPr>
             <w:tcW w:w="2200" w:type="dxa"/>
@@ -1177,7 +1202,25 @@
           <w:sz w:val="19"/>
           <w:szCs w:val="19"/>
         </w:rPr>
-        <w:t>Las normativas operativas y convenios de beneficios sufren modificaciones rápidas que suelen comunicarse primero por anexos o canales dinámicos antes de consolidarse en un PDF oficial. Priorizar por recencia asegura que el agente entregue la regla vigente exacta al momento del cobro en caja, evitando rechazos por desfases documentales.</w:t>
+        <w:t xml:space="preserve">Las normativas operativas y convenios de beneficios sufren modificaciones rápidas que suelen comunicarse primero por anexos o canales dinámicos antes de consolidarse en un PDF oficial. Priorizar por recencia asegura que el agente entregue la regla vigente exacta al momento del cobro en </w:t>
+      </w:r>
+      <w:proofErr w:type="gramStart"/>
+      <w:r>
+        <w:rPr>
+          <w:rFonts w:ascii="Calibri" w:eastAsia="Calibri" w:hAnsi="Calibri" w:cs="Calibri"/>
+          <w:sz w:val="19"/>
+          <w:szCs w:val="19"/>
+        </w:rPr>
+        <w:t>caja</w:t>
+      </w:r>
+      <w:proofErr w:type="gramEnd"/>
+      <w:r>
+        <w:rPr>
+          <w:rFonts w:ascii="Calibri" w:eastAsia="Calibri" w:hAnsi="Calibri" w:cs="Calibri"/>
+          <w:sz w:val="19"/>
+          <w:szCs w:val="19"/>
+        </w:rPr>
+        <w:t>, evitando rechazos por desfases documentales.</w:t>
       </w:r>
     </w:p>
     <w:p>
@@ -1254,7 +1297,25 @@
           <w:sz w:val="19"/>
           <w:szCs w:val="19"/>
         </w:rPr>
-        <w:t xml:space="preserve"> utilizado. Se priorizó evitar falsos positivos (umbral 0.9), dejando como respaldo que el generador recibe igualmente todos los fragmentos con sus fechas y puede razonar sobre recencia aunque el arbitraje automático no agrupe.</w:t>
+        <w:t xml:space="preserve"> utilizado. Se priorizó evitar falsos positivos (umbral 0.9), dejando como respaldo que el generador recibe igualmente todos los fragmentos con sus fechas y puede razonar sobre </w:t>
+      </w:r>
+      <w:proofErr w:type="gramStart"/>
+      <w:r>
+        <w:rPr>
+          <w:rFonts w:ascii="Calibri" w:eastAsia="Calibri" w:hAnsi="Calibri" w:cs="Calibri"/>
+          <w:sz w:val="19"/>
+          <w:szCs w:val="19"/>
+        </w:rPr>
+        <w:t>recencia</w:t>
+      </w:r>
+      <w:proofErr w:type="gramEnd"/>
+      <w:r>
+        <w:rPr>
+          <w:rFonts w:ascii="Calibri" w:eastAsia="Calibri" w:hAnsi="Calibri" w:cs="Calibri"/>
+          <w:sz w:val="19"/>
+          <w:szCs w:val="19"/>
+        </w:rPr>
+        <w:t xml:space="preserve"> aunque el arbitraje automático no agrupe.</w:t>
       </w:r>
     </w:p>
     <w:p>
@@ -1514,7 +1575,25 @@
           <w:sz w:val="19"/>
           <w:szCs w:val="19"/>
         </w:rPr>
-        <w:t xml:space="preserve"> Chile: un agente que interpreta la consulta, recupera información normativa real (el Manual de Orientaciones Técnicas BAES 2026) y decide entre responder o derivar a un ejecutivo humano, probado de punta a punta con datos y llamadas reales, no solo como un diseño teórico.</w:t>
+        <w:t xml:space="preserve"> Chile: un agente que interpreta la </w:t>
+      </w:r>
+      <w:proofErr w:type="gramStart"/>
+      <w:r>
+        <w:rPr>
+          <w:rFonts w:ascii="Calibri" w:eastAsia="Calibri" w:hAnsi="Calibri" w:cs="Calibri"/>
+          <w:sz w:val="19"/>
+          <w:szCs w:val="19"/>
+        </w:rPr>
+        <w:t>consulta,</w:t>
+      </w:r>
+      <w:proofErr w:type="gramEnd"/>
+      <w:r>
+        <w:rPr>
+          <w:rFonts w:ascii="Calibri" w:eastAsia="Calibri" w:hAnsi="Calibri" w:cs="Calibri"/>
+          <w:sz w:val="19"/>
+          <w:szCs w:val="19"/>
+        </w:rPr>
+        <w:t xml:space="preserve"> recupera información normativa real (el Manual de Orientaciones Técnicas BAES 2026) y decide entre responder o derivar a un ejecutivo humano, probado de punta a punta con datos y llamadas reales, no solo como un diseño teórico.</w:t>
       </w:r>
     </w:p>
     <w:p>

</xml_diff>